<commit_message>
empecé y me cuesta empezar
</commit_message>
<xml_diff>
--- a/vocabulario.docx
+++ b/vocabulario.docx
@@ -172,6 +172,74 @@
         </w:rPr>
         <w:t xml:space="preserve">. </w:t>
       </w:r>
+    </w:p>
+    <w:p>
+      <w:pPr>
+        <w:rPr>
+          <w:lang w:val="en-US"/>
+        </w:rPr>
+      </w:pPr>
+      <w:r>
+        <w:rPr>
+          <w:lang w:val="en-US"/>
+        </w:rPr>
+        <w:t xml:space="preserve">Remain: </w:t>
+      </w:r>
+      <w:proofErr w:type="spellStart"/>
+      <w:r>
+        <w:rPr>
+          <w:lang w:val="en-US"/>
+        </w:rPr>
+        <w:t>permanecer</w:t>
+      </w:r>
+      <w:proofErr w:type="spellEnd"/>
+      <w:r>
+        <w:rPr>
+          <w:lang w:val="en-US"/>
+        </w:rPr>
+        <w:t xml:space="preserve">  </w:t>
+      </w:r>
+    </w:p>
+    <w:p>
+      <w:pPr>
+        <w:rPr>
+          <w:lang w:val="en-US"/>
+        </w:rPr>
+      </w:pPr>
+    </w:p>
+    <w:p>
+      <w:pPr>
+        <w:rPr>
+          <w:lang w:val="en-US"/>
+        </w:rPr>
+      </w:pPr>
+      <w:r>
+        <w:rPr>
+          <w:lang w:val="en-US"/>
+        </w:rPr>
+        <w:t xml:space="preserve">Ancient: </w:t>
+      </w:r>
+      <w:proofErr w:type="spellStart"/>
+      <w:r>
+        <w:rPr>
+          <w:lang w:val="en-US"/>
+        </w:rPr>
+        <w:t>antiguo</w:t>
+      </w:r>
+      <w:proofErr w:type="spellEnd"/>
+      <w:r>
+        <w:rPr>
+          <w:lang w:val="en-US"/>
+        </w:rPr>
+        <w:t xml:space="preserve">. </w:t>
+      </w:r>
+    </w:p>
+    <w:p>
+      <w:pPr>
+        <w:rPr>
+          <w:lang w:val="en-US"/>
+        </w:rPr>
+      </w:pPr>
     </w:p>
     <w:p>
       <w:pPr>

</xml_diff>